<commit_message>
Update 2.6_GuiaEstudiante_Fase 2_Informe Final Proyecto APT.docx
</commit_message>
<xml_diff>
--- a/Fase 2/Evidencias Grupales/2.6_GuiaEstudiante_Fase 2_Informe Final Proyecto APT.docx
+++ b/Fase 2/Evidencias Grupales/2.6_GuiaEstudiante_Fase 2_Informe Final Proyecto APT.docx
@@ -1082,188 +1082,86 @@
           <w:p>
             <w:pPr>
               <w:pStyle w:val="paragraph"/>
-              <w:numPr>
-                <w:ilvl w:val="0"/>
-                <w:numId w:val="6"/>
-              </w:numPr>
-              <w:spacing w:before="0" w:beforeAutospacing="0" w:after="0" w:afterAutospacing="0"/>
-              <w:ind w:left="301" w:hanging="283"/>
+              <w:spacing w:after="0"/>
               <w:jc w:val="both"/>
               <w:textAlignment w:val="baseline"/>
               <w:rPr>
-                <w:rFonts w:ascii="Segoe UI" w:hAnsi="Segoe UI" w:cs="Segoe UI"/>
-                <w:color w:val="0070C0"/>
-                <w:sz w:val="18"/>
-                <w:szCs w:val="18"/>
-              </w:rPr>
-            </w:pPr>
-            <w:r>
-              <w:rPr>
-                <w:rStyle w:val="normaltextrun"/>
-                <w:rFonts w:ascii="Calibri" w:hAnsi="Calibri" w:cs="Calibri"/>
-                <w:i/>
-                <w:iCs/>
-                <w:color w:val="0070C0"/>
-                <w:sz w:val="18"/>
-                <w:szCs w:val="18"/>
-              </w:rPr>
-              <w:t>Señala qu</w:t>
-            </w:r>
-            <w:r>
-              <w:rPr>
                 <w:rStyle w:val="normaltextrun"/>
                 <w:rFonts w:ascii="Segoe UI" w:hAnsi="Segoe UI" w:cs="Segoe UI"/>
-                <w:i/>
-                <w:iCs/>
                 <w:color w:val="0070C0"/>
                 <w:sz w:val="18"/>
                 <w:szCs w:val="18"/>
               </w:rPr>
-              <w:t>é</w:t>
-            </w:r>
+            </w:pPr>
             <w:r>
               <w:rPr>
                 <w:rStyle w:val="normaltextrun"/>
-                <w:rFonts w:ascii="Calibri" w:hAnsi="Calibri" w:cs="Calibri"/>
-                <w:i/>
-                <w:iCs/>
+                <w:rFonts w:ascii="Segoe UI" w:hAnsi="Segoe UI" w:cs="Segoe UI"/>
                 <w:color w:val="0070C0"/>
                 <w:sz w:val="18"/>
                 <w:szCs w:val="18"/>
               </w:rPr>
-              <w:t xml:space="preserve"> problema busc</w:t>
+              <w:t xml:space="preserve">Instacotiza buscó (y busca) </w:t>
             </w:r>
             <w:r>
               <w:rPr>
                 <w:rStyle w:val="normaltextrun"/>
-                <w:rFonts w:ascii="Calibri" w:hAnsi="Calibri" w:cs="Calibri"/>
-                <w:i/>
-                <w:iCs/>
+                <w:rFonts w:ascii="Segoe UI" w:hAnsi="Segoe UI" w:cs="Segoe UI"/>
                 <w:color w:val="0070C0"/>
                 <w:sz w:val="18"/>
                 <w:szCs w:val="18"/>
               </w:rPr>
-              <w:t>ó</w:t>
+              <w:t xml:space="preserve">ser </w:t>
             </w:r>
             <w:r>
               <w:rPr>
                 <w:rStyle w:val="normaltextrun"/>
-                <w:rFonts w:ascii="Calibri" w:hAnsi="Calibri" w:cs="Calibri"/>
-                <w:i/>
-                <w:iCs/>
+                <w:rFonts w:ascii="Segoe UI" w:hAnsi="Segoe UI" w:cs="Segoe UI"/>
                 <w:color w:val="0070C0"/>
                 <w:sz w:val="18"/>
                 <w:szCs w:val="18"/>
               </w:rPr>
-              <w:t xml:space="preserve"> solucionar tu proyecto</w:t>
+              <w:t>solución para acelerar los procesos de negocio de las empresas, entregándoles un centro para crear, generar y gestionar cotizaciones para sus clientes desde cualquier dispositivo</w:t>
             </w:r>
             <w:r>
               <w:rPr>
                 <w:rStyle w:val="normaltextrun"/>
-                <w:rFonts w:ascii="Calibri" w:hAnsi="Calibri" w:cs="Calibri"/>
-                <w:i/>
-                <w:iCs/>
+                <w:rFonts w:ascii="Segoe UI" w:hAnsi="Segoe UI" w:cs="Segoe UI"/>
                 <w:color w:val="0070C0"/>
                 <w:sz w:val="18"/>
                 <w:szCs w:val="18"/>
               </w:rPr>
-              <w:t xml:space="preserve"> y</w:t>
+              <w:t>, c</w:t>
             </w:r>
             <w:r>
               <w:rPr>
                 <w:rStyle w:val="normaltextrun"/>
-                <w:rFonts w:ascii="Calibri" w:hAnsi="Calibri" w:cs="Calibri"/>
-                <w:i/>
-                <w:iCs/>
+                <w:rFonts w:ascii="Segoe UI" w:hAnsi="Segoe UI" w:cs="Segoe UI"/>
                 <w:color w:val="0070C0"/>
                 <w:sz w:val="18"/>
                 <w:szCs w:val="18"/>
               </w:rPr>
+              <w:t>on un actual foco particular en las obras civiles y con una mirada a expandirse a más rubros en el futuro.</w:t>
+            </w:r>
+            <w:r>
+              <w:rPr>
+                <w:rStyle w:val="normaltextrun"/>
+                <w:rFonts w:ascii="Segoe UI" w:hAnsi="Segoe UI" w:cs="Segoe UI"/>
+                <w:color w:val="0070C0"/>
+                <w:sz w:val="18"/>
+                <w:szCs w:val="18"/>
+              </w:rPr>
               <w:t xml:space="preserve"> </w:t>
             </w:r>
-            <w:r>
-              <w:rPr>
-                <w:rStyle w:val="normaltextrun"/>
-                <w:rFonts w:ascii="Calibri" w:hAnsi="Calibri" w:cs="Calibri"/>
-                <w:i/>
-                <w:iCs/>
-                <w:color w:val="0070C0"/>
-                <w:sz w:val="18"/>
-                <w:szCs w:val="18"/>
-              </w:rPr>
-              <w:t>su</w:t>
-            </w:r>
-            <w:r>
-              <w:rPr>
-                <w:rStyle w:val="normaltextrun"/>
-                <w:rFonts w:ascii="Calibri" w:hAnsi="Calibri" w:cs="Calibri"/>
-                <w:i/>
-                <w:iCs/>
-                <w:color w:val="0070C0"/>
-                <w:sz w:val="18"/>
-                <w:szCs w:val="18"/>
-              </w:rPr>
-              <w:t xml:space="preserve"> relevancia para e</w:t>
-            </w:r>
-            <w:r>
-              <w:rPr>
-                <w:rStyle w:val="normaltextrun"/>
-                <w:rFonts w:ascii="Calibri" w:hAnsi="Calibri" w:cs="Calibri"/>
-                <w:i/>
-                <w:iCs/>
-                <w:color w:val="0070C0"/>
-                <w:sz w:val="18"/>
-                <w:szCs w:val="18"/>
-              </w:rPr>
-              <w:t>l</w:t>
-            </w:r>
-            <w:r>
-              <w:rPr>
-                <w:rStyle w:val="normaltextrun"/>
-                <w:rFonts w:ascii="Calibri" w:hAnsi="Calibri" w:cs="Calibri"/>
-                <w:i/>
-                <w:iCs/>
-                <w:color w:val="0070C0"/>
-                <w:sz w:val="18"/>
-                <w:szCs w:val="18"/>
-              </w:rPr>
-              <w:t xml:space="preserve"> contexto de la profesión</w:t>
-            </w:r>
-            <w:r>
-              <w:rPr>
-                <w:rStyle w:val="normaltextrun"/>
-                <w:rFonts w:ascii="Calibri" w:hAnsi="Calibri" w:cs="Calibri"/>
-                <w:i/>
-                <w:iCs/>
-                <w:color w:val="0070C0"/>
-                <w:sz w:val="18"/>
-                <w:szCs w:val="18"/>
-              </w:rPr>
-              <w:t>. Algunas preguntas que pueden ayudarte a responder este apartado son: </w:t>
-            </w:r>
-            <w:r>
-              <w:rPr>
-                <w:rStyle w:val="eop"/>
-                <w:rFonts w:ascii="Calibri" w:hAnsi="Calibri" w:cs="Calibri"/>
-                <w:color w:val="0070C0"/>
-                <w:sz w:val="18"/>
-                <w:szCs w:val="18"/>
-              </w:rPr>
-              <w:t> </w:t>
-            </w:r>
           </w:p>
           <w:p>
             <w:pPr>
               <w:pStyle w:val="paragraph"/>
-              <w:numPr>
-                <w:ilvl w:val="0"/>
-                <w:numId w:val="5"/>
-              </w:numPr>
-              <w:spacing w:before="0" w:beforeAutospacing="0" w:after="0" w:afterAutospacing="0"/>
+              <w:spacing w:after="0"/>
               <w:jc w:val="both"/>
               <w:textAlignment w:val="baseline"/>
               <w:rPr>
-                <w:rFonts w:ascii="Calibri" w:hAnsi="Calibri" w:cs="Calibri"/>
+                <w:rFonts w:ascii="Segoe UI" w:hAnsi="Segoe UI" w:cs="Segoe UI"/>
                 <w:color w:val="0070C0"/>
                 <w:sz w:val="18"/>
                 <w:szCs w:val="18"/>
@@ -1272,232 +1170,68 @@
             <w:r>
               <w:rPr>
                 <w:rStyle w:val="normaltextrun"/>
-                <w:rFonts w:ascii="Calibri" w:hAnsi="Calibri" w:cs="Calibri"/>
-                <w:i/>
-                <w:iCs/>
+                <w:rFonts w:ascii="Segoe UI" w:hAnsi="Segoe UI" w:cs="Segoe UI"/>
                 <w:color w:val="0070C0"/>
                 <w:sz w:val="18"/>
                 <w:szCs w:val="18"/>
               </w:rPr>
-              <w:t>¿Por qué es relevante este tema para el campo laboral de tu carrera?</w:t>
-            </w:r>
-            <w:r>
-              <w:rPr>
-                <w:rStyle w:val="eop"/>
-                <w:rFonts w:ascii="Calibri" w:hAnsi="Calibri" w:cs="Calibri"/>
+              <w:t xml:space="preserve">Es relevante para el campo laboral de la carrera puesto que, si bien se tiene un </w:t>
+            </w:r>
+            <w:proofErr w:type="spellStart"/>
+            <w:r>
+              <w:rPr>
+                <w:rStyle w:val="normaltextrun"/>
+                <w:rFonts w:ascii="Segoe UI" w:hAnsi="Segoe UI" w:cs="Segoe UI"/>
                 <w:color w:val="0070C0"/>
                 <w:sz w:val="18"/>
                 <w:szCs w:val="18"/>
               </w:rPr>
-              <w:t> </w:t>
-            </w:r>
-          </w:p>
-          <w:p>
-            <w:pPr>
-              <w:pStyle w:val="paragraph"/>
-              <w:numPr>
-                <w:ilvl w:val="0"/>
-                <w:numId w:val="5"/>
-              </w:numPr>
-              <w:spacing w:before="0" w:beforeAutospacing="0" w:after="0" w:afterAutospacing="0"/>
-              <w:jc w:val="both"/>
-              <w:textAlignment w:val="baseline"/>
-              <w:rPr>
-                <w:rFonts w:ascii="Calibri" w:hAnsi="Calibri" w:cs="Calibri"/>
+              <w:t>early</w:t>
+            </w:r>
+            <w:proofErr w:type="spellEnd"/>
+            <w:r>
+              <w:rPr>
+                <w:rStyle w:val="normaltextrun"/>
+                <w:rFonts w:ascii="Segoe UI" w:hAnsi="Segoe UI" w:cs="Segoe UI"/>
                 <w:color w:val="0070C0"/>
                 <w:sz w:val="18"/>
                 <w:szCs w:val="18"/>
               </w:rPr>
-            </w:pPr>
+              <w:t xml:space="preserve"> </w:t>
+            </w:r>
+            <w:proofErr w:type="spellStart"/>
             <w:r>
               <w:rPr>
                 <w:rStyle w:val="normaltextrun"/>
-                <w:rFonts w:ascii="Calibri" w:hAnsi="Calibri" w:cs="Calibri"/>
-                <w:i/>
-                <w:iCs/>
+                <w:rFonts w:ascii="Segoe UI" w:hAnsi="Segoe UI" w:cs="Segoe UI"/>
                 <w:color w:val="0070C0"/>
                 <w:sz w:val="18"/>
                 <w:szCs w:val="18"/>
               </w:rPr>
-              <w:t>¿Dónde se ubica la situación que vas a abordar? (Ej.: País, región, comuna o institución) ¿Cuáles son las características principales de ese lugar? </w:t>
-            </w:r>
-            <w:r>
-              <w:rPr>
-                <w:rStyle w:val="eop"/>
-                <w:rFonts w:ascii="Calibri" w:hAnsi="Calibri" w:cs="Calibri"/>
+              <w:t>adopter</w:t>
+            </w:r>
+            <w:proofErr w:type="spellEnd"/>
+            <w:r>
+              <w:rPr>
+                <w:rStyle w:val="normaltextrun"/>
+                <w:rFonts w:ascii="Segoe UI" w:hAnsi="Segoe UI" w:cs="Segoe UI"/>
                 <w:color w:val="0070C0"/>
                 <w:sz w:val="18"/>
                 <w:szCs w:val="18"/>
               </w:rPr>
-              <w:t> </w:t>
-            </w:r>
-          </w:p>
-          <w:p>
-            <w:pPr>
-              <w:pStyle w:val="paragraph"/>
-              <w:numPr>
-                <w:ilvl w:val="0"/>
-                <w:numId w:val="5"/>
-              </w:numPr>
-              <w:spacing w:before="0" w:beforeAutospacing="0" w:after="0" w:afterAutospacing="0"/>
-              <w:jc w:val="both"/>
-              <w:textAlignment w:val="baseline"/>
-              <w:rPr>
-                <w:rFonts w:ascii="Calibri" w:hAnsi="Calibri" w:cs="Calibri"/>
+              <w:t xml:space="preserve">, es al final eso, un adoptante temprano y no un cliente particular. Instacotiza busca evidenciar que el trabajo de un informático no siempre debiese ser por demanda o solicitud sino también puede surgir debido a la propia iniciativa de ofrecer un servicio. Chile por ahora es el foco principal del proyecto, en nuestro país </w:t>
+            </w:r>
+            <w:r>
+              <w:rPr>
+                <w:rStyle w:val="normaltextrun"/>
+                <w:rFonts w:ascii="Segoe UI" w:hAnsi="Segoe UI" w:cs="Segoe UI"/>
                 <w:color w:val="0070C0"/>
                 <w:sz w:val="18"/>
                 <w:szCs w:val="18"/>
               </w:rPr>
-            </w:pPr>
-            <w:r>
-              <w:rPr>
-                <w:rStyle w:val="normaltextrun"/>
-                <w:rFonts w:ascii="Calibri" w:hAnsi="Calibri" w:cs="Calibri"/>
-                <w:i/>
-                <w:iCs/>
-                <w:color w:val="0070C0"/>
-                <w:sz w:val="18"/>
-                <w:szCs w:val="18"/>
-              </w:rPr>
-              <w:t xml:space="preserve">¿A quiénes afecta o impacta la situación que </w:t>
-            </w:r>
-            <w:r>
-              <w:rPr>
-                <w:rStyle w:val="normaltextrun"/>
-                <w:rFonts w:ascii="Calibri" w:hAnsi="Calibri" w:cs="Calibri"/>
-                <w:i/>
-                <w:iCs/>
-                <w:color w:val="0070C0"/>
-                <w:sz w:val="18"/>
-                <w:szCs w:val="18"/>
-              </w:rPr>
-              <w:t>abordaste</w:t>
-            </w:r>
-            <w:r>
-              <w:rPr>
-                <w:rStyle w:val="normaltextrun"/>
-                <w:rFonts w:ascii="Calibri" w:hAnsi="Calibri" w:cs="Calibri"/>
-                <w:i/>
-                <w:iCs/>
-                <w:color w:val="0070C0"/>
-                <w:sz w:val="18"/>
-                <w:szCs w:val="18"/>
-              </w:rPr>
-              <w:t>? (Ej.: Grupo etario, usuarios de algún servicio, etc.).</w:t>
-            </w:r>
-            <w:r>
-              <w:rPr>
-                <w:rStyle w:val="eop"/>
-                <w:rFonts w:ascii="Calibri" w:hAnsi="Calibri" w:cs="Calibri"/>
-                <w:color w:val="0070C0"/>
-                <w:sz w:val="18"/>
-                <w:szCs w:val="18"/>
-              </w:rPr>
-              <w:t> </w:t>
-            </w:r>
-          </w:p>
-          <w:p>
-            <w:pPr>
-              <w:pStyle w:val="paragraph"/>
-              <w:numPr>
-                <w:ilvl w:val="0"/>
-                <w:numId w:val="5"/>
-              </w:numPr>
-              <w:spacing w:before="0" w:beforeAutospacing="0" w:after="0" w:afterAutospacing="0"/>
-              <w:jc w:val="both"/>
-              <w:textAlignment w:val="baseline"/>
-              <w:rPr>
-                <w:rFonts w:ascii="Calibri" w:hAnsi="Calibri" w:cs="Calibri"/>
-                <w:color w:val="0070C0"/>
-                <w:sz w:val="18"/>
-                <w:szCs w:val="18"/>
-              </w:rPr>
-            </w:pPr>
-            <w:r>
-              <w:rPr>
-                <w:rStyle w:val="normaltextrun"/>
-                <w:rFonts w:ascii="Calibri" w:hAnsi="Calibri" w:cs="Calibri"/>
-                <w:i/>
-                <w:iCs/>
-                <w:color w:val="0070C0"/>
-                <w:sz w:val="18"/>
-                <w:szCs w:val="18"/>
-              </w:rPr>
-              <w:t xml:space="preserve">¿Cuál </w:t>
-            </w:r>
-            <w:r>
-              <w:rPr>
-                <w:rStyle w:val="normaltextrun"/>
-                <w:rFonts w:ascii="Calibri" w:hAnsi="Calibri" w:cs="Calibri"/>
-                <w:i/>
-                <w:iCs/>
-                <w:color w:val="0070C0"/>
-                <w:sz w:val="18"/>
-                <w:szCs w:val="18"/>
-              </w:rPr>
-              <w:t>fue</w:t>
-            </w:r>
-            <w:r>
-              <w:rPr>
-                <w:rStyle w:val="normaltextrun"/>
-                <w:rFonts w:ascii="Calibri" w:hAnsi="Calibri" w:cs="Calibri"/>
-                <w:i/>
-                <w:iCs/>
-                <w:color w:val="0070C0"/>
-                <w:sz w:val="18"/>
-                <w:szCs w:val="18"/>
-              </w:rPr>
-              <w:t xml:space="preserve"> el aporte de valor (real o simulado) de tu Proyecto APT para el contexto laboral y/o social en que se situ</w:t>
-            </w:r>
-            <w:r>
-              <w:rPr>
-                <w:rStyle w:val="normaltextrun"/>
-                <w:rFonts w:ascii="Calibri" w:hAnsi="Calibri" w:cs="Calibri"/>
-                <w:i/>
-                <w:iCs/>
-                <w:color w:val="0070C0"/>
-                <w:sz w:val="18"/>
-                <w:szCs w:val="18"/>
-              </w:rPr>
-              <w:t>ó</w:t>
-            </w:r>
-            <w:r>
-              <w:rPr>
-                <w:rStyle w:val="normaltextrun"/>
-                <w:rFonts w:ascii="Calibri" w:hAnsi="Calibri" w:cs="Calibri"/>
-                <w:i/>
-                <w:iCs/>
-                <w:color w:val="0070C0"/>
-                <w:sz w:val="18"/>
-                <w:szCs w:val="18"/>
-              </w:rPr>
-              <w:t>?</w:t>
-            </w:r>
-            <w:r>
-              <w:rPr>
-                <w:rStyle w:val="eop"/>
-                <w:rFonts w:ascii="Calibri" w:hAnsi="Calibri" w:cs="Calibri"/>
-                <w:color w:val="0070C0"/>
-                <w:sz w:val="18"/>
-                <w:szCs w:val="18"/>
-              </w:rPr>
-              <w:t> </w:t>
-            </w:r>
-          </w:p>
-          <w:p>
-            <w:pPr>
-              <w:pStyle w:val="Prrafodelista"/>
-              <w:spacing w:after="0" w:line="240" w:lineRule="auto"/>
-              <w:jc w:val="both"/>
-              <w:rPr>
-                <w:rFonts w:ascii="Calibri" w:hAnsi="Calibri" w:cs="Arial"/>
-                <w:i/>
-                <w:color w:val="0070C0"/>
-                <w:sz w:val="18"/>
-                <w:szCs w:val="20"/>
-                <w:lang w:eastAsia="es-CL"/>
-              </w:rPr>
-            </w:pPr>
+              <w:lastRenderedPageBreak/>
+              <w:t>la construcción es un rubro con personas que no necesariamente saben manejarse con herramientas de ofimática móvil, siendo estos los principales beneficiarios del servicio, siendo así una herramienta para cualquiera, que permite manejar, acelerar y tener orden sobre las cotizaciones.</w:t>
+            </w:r>
           </w:p>
         </w:tc>
       </w:tr>
@@ -1594,6 +1328,7 @@
                 <w:lang w:val="es-MX" w:eastAsia="es-CL"/>
               </w:rPr>
             </w:pPr>
+            <w:proofErr w:type="spellStart"/>
             <w:r>
               <w:rPr>
                 <w:rFonts w:ascii="Calibri" w:hAnsi="Calibri" w:cs="Arial"/>
@@ -1614,7 +1349,19 @@
                 <w:szCs w:val="20"/>
                 <w:lang w:val="es-MX" w:eastAsia="es-CL"/>
               </w:rPr>
-              <w:t>ífico:</w:t>
+              <w:t>ífico</w:t>
+            </w:r>
+            <w:proofErr w:type="spellEnd"/>
+            <w:r>
+              <w:rPr>
+                <w:rFonts w:ascii="Calibri" w:hAnsi="Calibri" w:cs="Arial"/>
+                <w:i/>
+                <w:color w:val="0070C0"/>
+                <w:sz w:val="18"/>
+                <w:szCs w:val="20"/>
+                <w:lang w:val="es-MX" w:eastAsia="es-CL"/>
+              </w:rPr>
+              <w:t>:</w:t>
             </w:r>
           </w:p>
           <w:p>
@@ -1638,7 +1385,44 @@
                 <w:szCs w:val="20"/>
                 <w:lang w:val="es-MX" w:eastAsia="es-CL"/>
               </w:rPr>
-              <w:t>El proyecto busca diseñar un sistema web responsive que permitirá la realización de presupuestos de ventas para distintos sectores. Además, permitirá, para usuarios no registrados, guardar plantillas de cotizaciones para volverlas a cargar al sitio usando archivos en formato '.json'. Para usuarios registrados permitirá guardar las plantillas en la nube para poder tener un acceso más rápido y sincronizado entre dispositivos.</w:t>
+              <w:t xml:space="preserve">El proyecto busca diseñar un sistema web responsive que permitirá la realización de presupuestos de ventas para distintos sectores. Además, permitirá, para usuarios no registrados, guardar plantillas de cotizaciones para volverlas a cargar al sitio usando archivos en formato </w:t>
+            </w:r>
+            <w:proofErr w:type="gramStart"/>
+            <w:r>
+              <w:rPr>
+                <w:rFonts w:ascii="Calibri" w:hAnsi="Calibri" w:cs="Arial"/>
+                <w:i/>
+                <w:color w:val="0070C0"/>
+                <w:sz w:val="18"/>
+                <w:szCs w:val="20"/>
+                <w:lang w:val="es-MX" w:eastAsia="es-CL"/>
+              </w:rPr>
+              <w:t>'.</w:t>
+            </w:r>
+            <w:proofErr w:type="spellStart"/>
+            <w:r>
+              <w:rPr>
+                <w:rFonts w:ascii="Calibri" w:hAnsi="Calibri" w:cs="Arial"/>
+                <w:i/>
+                <w:color w:val="0070C0"/>
+                <w:sz w:val="18"/>
+                <w:szCs w:val="20"/>
+                <w:lang w:val="es-MX" w:eastAsia="es-CL"/>
+              </w:rPr>
+              <w:t>json</w:t>
+            </w:r>
+            <w:proofErr w:type="spellEnd"/>
+            <w:proofErr w:type="gramEnd"/>
+            <w:r>
+              <w:rPr>
+                <w:rFonts w:ascii="Calibri" w:hAnsi="Calibri" w:cs="Arial"/>
+                <w:i/>
+                <w:color w:val="0070C0"/>
+                <w:sz w:val="18"/>
+                <w:szCs w:val="20"/>
+                <w:lang w:val="es-MX" w:eastAsia="es-CL"/>
+              </w:rPr>
+              <w:t>'. Para usuarios registrados permitirá guardar las plantillas en la nube para poder tener un acceso más rápido y sincronizado entre dispositivos.</w:t>
             </w:r>
           </w:p>
           <w:p>
@@ -1727,30 +1511,174 @@
                 <w:szCs w:val="20"/>
                 <w:lang w:eastAsia="es-CL"/>
               </w:rPr>
-              <w:t xml:space="preserve"> una metodología ágil (scrum) basada en las actualizaciones, mejoras, cambios semanales (sprints) en el proyecto con participación activa del early adopter y el uso de una carta gantt como guía para tener referencias del progreso de desarrollo del proyecto en base al cumplimiento de 5 épicas principales. El desarrollo se dividirá en 3 Épicas.</w:t>
-            </w:r>
-          </w:p>
-          <w:p>
-            <w:pPr>
-              <w:rPr>
-                <w:rFonts w:ascii="Calibri" w:hAnsi="Calibri" w:cs="Arial"/>
-                <w:i/>
-                <w:color w:val="0070C0"/>
-                <w:sz w:val="18"/>
-                <w:szCs w:val="20"/>
-                <w:lang w:eastAsia="es-CL"/>
-              </w:rPr>
-            </w:pPr>
-            <w:r>
-              <w:rPr>
-                <w:rFonts w:ascii="Calibri" w:hAnsi="Calibri" w:cs="Arial"/>
-                <w:i/>
-                <w:color w:val="0070C0"/>
-                <w:sz w:val="18"/>
-                <w:szCs w:val="20"/>
-                <w:lang w:eastAsia="es-CL"/>
-              </w:rPr>
-              <w:t>Esta metodología es esencial para el proyecto pues es la que permite tener una interacción constante con el early adopter, permitiendo corregir, modificar o añadir elementos al proyecto de forma ágil sin necesitar de un proceso más burocrático y extenso.</w:t>
+              <w:t xml:space="preserve"> una metodología ágil (scrum) basada en las actualizaciones, mejoras, cambios semanales (sprints) en el proyecto con </w:t>
+            </w:r>
+            <w:proofErr w:type="gramStart"/>
+            <w:r>
+              <w:rPr>
+                <w:rFonts w:ascii="Calibri" w:hAnsi="Calibri" w:cs="Arial"/>
+                <w:i/>
+                <w:color w:val="0070C0"/>
+                <w:sz w:val="18"/>
+                <w:szCs w:val="20"/>
+                <w:lang w:eastAsia="es-CL"/>
+              </w:rPr>
+              <w:t>participación activa</w:t>
+            </w:r>
+            <w:proofErr w:type="gramEnd"/>
+            <w:r>
+              <w:rPr>
+                <w:rFonts w:ascii="Calibri" w:hAnsi="Calibri" w:cs="Arial"/>
+                <w:i/>
+                <w:color w:val="0070C0"/>
+                <w:sz w:val="18"/>
+                <w:szCs w:val="20"/>
+                <w:lang w:eastAsia="es-CL"/>
+              </w:rPr>
+              <w:t xml:space="preserve"> del </w:t>
+            </w:r>
+            <w:proofErr w:type="spellStart"/>
+            <w:r>
+              <w:rPr>
+                <w:rFonts w:ascii="Calibri" w:hAnsi="Calibri" w:cs="Arial"/>
+                <w:i/>
+                <w:color w:val="0070C0"/>
+                <w:sz w:val="18"/>
+                <w:szCs w:val="20"/>
+                <w:lang w:eastAsia="es-CL"/>
+              </w:rPr>
+              <w:t>early</w:t>
+            </w:r>
+            <w:proofErr w:type="spellEnd"/>
+            <w:r>
+              <w:rPr>
+                <w:rFonts w:ascii="Calibri" w:hAnsi="Calibri" w:cs="Arial"/>
+                <w:i/>
+                <w:color w:val="0070C0"/>
+                <w:sz w:val="18"/>
+                <w:szCs w:val="20"/>
+                <w:lang w:eastAsia="es-CL"/>
+              </w:rPr>
+              <w:t xml:space="preserve"> </w:t>
+            </w:r>
+            <w:proofErr w:type="spellStart"/>
+            <w:r>
+              <w:rPr>
+                <w:rFonts w:ascii="Calibri" w:hAnsi="Calibri" w:cs="Arial"/>
+                <w:i/>
+                <w:color w:val="0070C0"/>
+                <w:sz w:val="18"/>
+                <w:szCs w:val="20"/>
+                <w:lang w:eastAsia="es-CL"/>
+              </w:rPr>
+              <w:t>adopter</w:t>
+            </w:r>
+            <w:proofErr w:type="spellEnd"/>
+            <w:r>
+              <w:rPr>
+                <w:rFonts w:ascii="Calibri" w:hAnsi="Calibri" w:cs="Arial"/>
+                <w:i/>
+                <w:color w:val="0070C0"/>
+                <w:sz w:val="18"/>
+                <w:szCs w:val="20"/>
+                <w:lang w:eastAsia="es-CL"/>
+              </w:rPr>
+              <w:t xml:space="preserve"> y el uso de una carta </w:t>
+            </w:r>
+            <w:proofErr w:type="spellStart"/>
+            <w:r>
+              <w:rPr>
+                <w:rFonts w:ascii="Calibri" w:hAnsi="Calibri" w:cs="Arial"/>
+                <w:i/>
+                <w:color w:val="0070C0"/>
+                <w:sz w:val="18"/>
+                <w:szCs w:val="20"/>
+                <w:lang w:eastAsia="es-CL"/>
+              </w:rPr>
+              <w:t>gantt</w:t>
+            </w:r>
+            <w:proofErr w:type="spellEnd"/>
+            <w:r>
+              <w:rPr>
+                <w:rFonts w:ascii="Calibri" w:hAnsi="Calibri" w:cs="Arial"/>
+                <w:i/>
+                <w:color w:val="0070C0"/>
+                <w:sz w:val="18"/>
+                <w:szCs w:val="20"/>
+                <w:lang w:eastAsia="es-CL"/>
+              </w:rPr>
+              <w:t xml:space="preserve"> como guía para tener referencias del progreso de desarrollo del proyecto en base al cumplimiento de 5 épicas principales. El desarrollo se dividirá en 3 Épicas.</w:t>
+            </w:r>
+          </w:p>
+          <w:p>
+            <w:pPr>
+              <w:rPr>
+                <w:rFonts w:ascii="Calibri" w:hAnsi="Calibri" w:cs="Arial"/>
+                <w:i/>
+                <w:color w:val="0070C0"/>
+                <w:sz w:val="18"/>
+                <w:szCs w:val="20"/>
+                <w:lang w:eastAsia="es-CL"/>
+              </w:rPr>
+            </w:pPr>
+            <w:r>
+              <w:rPr>
+                <w:rFonts w:ascii="Calibri" w:hAnsi="Calibri" w:cs="Arial"/>
+                <w:i/>
+                <w:color w:val="0070C0"/>
+                <w:sz w:val="18"/>
+                <w:szCs w:val="20"/>
+                <w:lang w:eastAsia="es-CL"/>
+              </w:rPr>
+              <w:t xml:space="preserve">Esta metodología es esencial para el proyecto pues es la que permite tener una interacción constante con el </w:t>
+            </w:r>
+            <w:proofErr w:type="spellStart"/>
+            <w:r>
+              <w:rPr>
+                <w:rFonts w:ascii="Calibri" w:hAnsi="Calibri" w:cs="Arial"/>
+                <w:i/>
+                <w:color w:val="0070C0"/>
+                <w:sz w:val="18"/>
+                <w:szCs w:val="20"/>
+                <w:lang w:eastAsia="es-CL"/>
+              </w:rPr>
+              <w:t>early</w:t>
+            </w:r>
+            <w:proofErr w:type="spellEnd"/>
+            <w:r>
+              <w:rPr>
+                <w:rFonts w:ascii="Calibri" w:hAnsi="Calibri" w:cs="Arial"/>
+                <w:i/>
+                <w:color w:val="0070C0"/>
+                <w:sz w:val="18"/>
+                <w:szCs w:val="20"/>
+                <w:lang w:eastAsia="es-CL"/>
+              </w:rPr>
+              <w:t xml:space="preserve"> </w:t>
+            </w:r>
+            <w:proofErr w:type="spellStart"/>
+            <w:r>
+              <w:rPr>
+                <w:rFonts w:ascii="Calibri" w:hAnsi="Calibri" w:cs="Arial"/>
+                <w:i/>
+                <w:color w:val="0070C0"/>
+                <w:sz w:val="18"/>
+                <w:szCs w:val="20"/>
+                <w:lang w:eastAsia="es-CL"/>
+              </w:rPr>
+              <w:t>adopter</w:t>
+            </w:r>
+            <w:proofErr w:type="spellEnd"/>
+            <w:r>
+              <w:rPr>
+                <w:rFonts w:ascii="Calibri" w:hAnsi="Calibri" w:cs="Arial"/>
+                <w:i/>
+                <w:color w:val="0070C0"/>
+                <w:sz w:val="18"/>
+                <w:szCs w:val="20"/>
+                <w:lang w:eastAsia="es-CL"/>
+              </w:rPr>
+              <w:t>, permitiendo corregir, modificar o añadir elementos al proyecto de forma ágil sin necesitar de un proceso más burocrático y extenso.</w:t>
             </w:r>
           </w:p>
         </w:tc>
@@ -1887,7 +1815,55 @@
                 <w:szCs w:val="20"/>
                 <w:lang w:eastAsia="es-CL"/>
               </w:rPr>
-              <w:t>Desarrollo (EPICA 1 a 3): Semana 5 a 12. Abarca el desarrollo duro del proyecto, donde se desarrollan sus componentes principales, la base de datos y las funciones y métodos que harán funcionar las principales características del proyecto, siendo estas los cotizadores (para registrados y no registrados) y todo lo que abarca la gestión de usuarios. Las mayores dificultades se tuvieron con la integración del backend en mongoDB, que finalmente se solucionó montando un api en un servicio externo (render).</w:t>
+              <w:t xml:space="preserve">Desarrollo (EPICA 1 a 3): Semana 5 a 12. Abarca el desarrollo duro del proyecto, donde se desarrollan sus componentes principales, la base de datos y las funciones y métodos que harán funcionar las principales características del proyecto, siendo estas los </w:t>
+            </w:r>
+            <w:proofErr w:type="spellStart"/>
+            <w:r>
+              <w:rPr>
+                <w:rFonts w:ascii="Calibri" w:hAnsi="Calibri" w:cs="Arial"/>
+                <w:i/>
+                <w:color w:val="0070C0"/>
+                <w:sz w:val="18"/>
+                <w:szCs w:val="20"/>
+                <w:lang w:eastAsia="es-CL"/>
+              </w:rPr>
+              <w:t>cotizadores</w:t>
+            </w:r>
+            <w:proofErr w:type="spellEnd"/>
+            <w:r>
+              <w:rPr>
+                <w:rFonts w:ascii="Calibri" w:hAnsi="Calibri" w:cs="Arial"/>
+                <w:i/>
+                <w:color w:val="0070C0"/>
+                <w:sz w:val="18"/>
+                <w:szCs w:val="20"/>
+                <w:lang w:eastAsia="es-CL"/>
+              </w:rPr>
+              <w:t xml:space="preserve"> (para registrados y no registrados) y todo lo que abarca la gestión de usuarios. Las mayores dificultades se tuvieron con la integración del backend en </w:t>
+            </w:r>
+            <w:proofErr w:type="spellStart"/>
+            <w:r>
+              <w:rPr>
+                <w:rFonts w:ascii="Calibri" w:hAnsi="Calibri" w:cs="Arial"/>
+                <w:i/>
+                <w:color w:val="0070C0"/>
+                <w:sz w:val="18"/>
+                <w:szCs w:val="20"/>
+                <w:lang w:eastAsia="es-CL"/>
+              </w:rPr>
+              <w:t>mongoDB</w:t>
+            </w:r>
+            <w:proofErr w:type="spellEnd"/>
+            <w:r>
+              <w:rPr>
+                <w:rFonts w:ascii="Calibri" w:hAnsi="Calibri" w:cs="Arial"/>
+                <w:i/>
+                <w:color w:val="0070C0"/>
+                <w:sz w:val="18"/>
+                <w:szCs w:val="20"/>
+                <w:lang w:eastAsia="es-CL"/>
+              </w:rPr>
+              <w:t>, que finalmente se solucionó montando un api en un servicio externo (render).</w:t>
             </w:r>
           </w:p>
           <w:p>
@@ -2004,6 +1980,7 @@
                 <w:color w:val="1F3864" w:themeColor="accent1" w:themeShade="80"/>
                 <w:sz w:val="18"/>
               </w:rPr>
+              <w:lastRenderedPageBreak/>
               <w:t>5. Evidencias</w:t>
             </w:r>
           </w:p>
@@ -2096,7 +2073,6 @@
                 <w:sz w:val="18"/>
                 <w:szCs w:val="18"/>
               </w:rPr>
-              <w:lastRenderedPageBreak/>
               <w:t>6</w:t>
             </w:r>
             <w:r>
@@ -2144,13 +2120,7 @@
           </w:tcPr>
           <w:p>
             <w:pPr>
-              <w:pStyle w:val="Prrafodelista"/>
-              <w:numPr>
-                <w:ilvl w:val="0"/>
-                <w:numId w:val="1"/>
-              </w:numPr>
               <w:spacing w:after="0" w:line="240" w:lineRule="auto"/>
-              <w:ind w:left="314" w:hanging="284"/>
               <w:jc w:val="both"/>
               <w:rPr>
                 <w:rFonts w:ascii="Calibri" w:hAnsi="Calibri" w:cs="Arial"/>
@@ -2172,9 +2142,13 @@
                 <w:szCs w:val="18"/>
                 <w:lang w:eastAsia="es-CL"/>
               </w:rPr>
-              <w:t xml:space="preserve">Reflexión sobre el aporte del Proyecto APT en el </w:t>
-            </w:r>
-            <w:r>
+              <w:t>Como grupo, el proyecto nos ha servido para aumentar nuestros conocimientos en los cargos que decidimos tomar para desarrollar el proyecto, particularmente:</w:t>
+            </w:r>
+          </w:p>
+          <w:p>
+            <w:pPr>
+              <w:spacing w:after="0" w:line="240" w:lineRule="auto"/>
+              <w:jc w:val="both"/>
               <w:rPr>
                 <w:rFonts w:ascii="Calibri" w:hAnsi="Calibri" w:cs="Arial"/>
                 <w:i/>
@@ -2184,11 +2158,16 @@
                 <w:szCs w:val="18"/>
                 <w:lang w:eastAsia="es-CL"/>
               </w:rPr>
-              <w:t xml:space="preserve">desarrollo </w:t>
-            </w:r>
-            <w:r>
-              <w:rPr>
-                <w:rFonts w:ascii="Calibri" w:hAnsi="Calibri" w:cs="Arial"/>
+            </w:pPr>
+          </w:p>
+          <w:p>
+            <w:pPr>
+              <w:spacing w:after="0" w:line="240" w:lineRule="auto"/>
+              <w:jc w:val="both"/>
+              <w:rPr>
+                <w:rFonts w:ascii="Calibri" w:hAnsi="Calibri" w:cs="Arial"/>
+                <w:b/>
+                <w:bCs/>
                 <w:i/>
                 <w:iCs/>
                 <w:color w:val="0070C0"/>
@@ -2196,43 +2175,42 @@
                 <w:szCs w:val="18"/>
                 <w:lang w:eastAsia="es-CL"/>
               </w:rPr>
-              <w:t>de los intereses profesionales.</w:t>
-            </w:r>
-          </w:p>
-          <w:p>
-            <w:pPr>
-              <w:pStyle w:val="Prrafodelista"/>
+            </w:pPr>
+            <w:r>
+              <w:rPr>
+                <w:rFonts w:ascii="Calibri" w:hAnsi="Calibri" w:cs="Arial"/>
+                <w:b/>
+                <w:bCs/>
+                <w:i/>
+                <w:iCs/>
+                <w:color w:val="0070C0"/>
+                <w:sz w:val="18"/>
+                <w:szCs w:val="18"/>
+                <w:lang w:eastAsia="es-CL"/>
+              </w:rPr>
+              <w:t>Jorge Muñoz:</w:t>
+            </w:r>
+          </w:p>
+          <w:p>
+            <w:pPr>
+              <w:spacing w:after="0" w:line="240" w:lineRule="auto"/>
               <w:jc w:val="both"/>
               <w:rPr>
                 <w:rFonts w:ascii="Calibri" w:hAnsi="Calibri" w:cs="Arial"/>
-                <w:i/>
-                <w:color w:val="0070C0"/>
-                <w:sz w:val="18"/>
-                <w:szCs w:val="20"/>
-                <w:lang w:eastAsia="es-CL"/>
-              </w:rPr>
-            </w:pPr>
-            <w:r>
-              <w:rPr>
-                <w:rFonts w:ascii="Calibri" w:hAnsi="Calibri" w:cs="Arial"/>
-                <w:i/>
-                <w:color w:val="0070C0"/>
-                <w:sz w:val="18"/>
-                <w:szCs w:val="20"/>
-                <w:lang w:eastAsia="es-CL"/>
-              </w:rPr>
-              <w:t>¿De qué manera tu Proyecto APT te sirvió para tener mayor conocimiento de tus intereses profesionales? Luego de terminar tu Proyecto APT, ¿tus intereses profesionales siguen siendo los mismos que planteaste al comienzo de la asignatura?</w:t>
-            </w:r>
-          </w:p>
-          <w:p>
-            <w:pPr>
-              <w:pStyle w:val="Prrafodelista"/>
-              <w:numPr>
-                <w:ilvl w:val="0"/>
-                <w:numId w:val="1"/>
-              </w:numPr>
+                <w:b/>
+                <w:bCs/>
+                <w:i/>
+                <w:iCs/>
+                <w:color w:val="0070C0"/>
+                <w:sz w:val="18"/>
+                <w:szCs w:val="18"/>
+                <w:lang w:eastAsia="es-CL"/>
+              </w:rPr>
+            </w:pPr>
+          </w:p>
+          <w:p>
+            <w:pPr>
               <w:spacing w:after="0" w:line="240" w:lineRule="auto"/>
-              <w:ind w:left="314" w:hanging="284"/>
               <w:jc w:val="both"/>
               <w:rPr>
                 <w:rFonts w:ascii="Calibri" w:hAnsi="Calibri" w:cs="Arial"/>
@@ -2240,7 +2218,7 @@
                 <w:iCs/>
                 <w:color w:val="0070C0"/>
                 <w:sz w:val="18"/>
-                <w:szCs w:val="20"/>
+                <w:szCs w:val="18"/>
                 <w:lang w:eastAsia="es-CL"/>
               </w:rPr>
             </w:pPr>
@@ -2251,60 +2229,243 @@
                 <w:iCs/>
                 <w:color w:val="0070C0"/>
                 <w:sz w:val="18"/>
-                <w:szCs w:val="20"/>
-                <w:lang w:eastAsia="es-CL"/>
-              </w:rPr>
-              <w:t>Proyecciones laborales a partir de Proyecto APT.</w:t>
-            </w:r>
-          </w:p>
-          <w:p>
-            <w:pPr>
-              <w:pStyle w:val="Prrafodelista"/>
+                <w:szCs w:val="18"/>
+                <w:lang w:eastAsia="es-CL"/>
+              </w:rPr>
+              <w:t>Instacotiza me sirvió mucho para tener una experiencia más real en lo que se refiere a datos y backend, personalmente siento que me ha hecho gustar más de las bases de datos en particular, configurar la api y el desafío que fue conectar el proyecto desde el backend a la base de datos, además del desarrollo de las funciones para generar los documentos me han hecho mejorar en mis capacidades de lógica de programación</w:t>
+            </w:r>
+            <w:r>
+              <w:rPr>
+                <w:rFonts w:ascii="Calibri" w:hAnsi="Calibri" w:cs="Arial"/>
+                <w:i/>
+                <w:iCs/>
+                <w:color w:val="0070C0"/>
+                <w:sz w:val="18"/>
+                <w:szCs w:val="18"/>
+                <w:lang w:eastAsia="es-CL"/>
+              </w:rPr>
+              <w:t xml:space="preserve">, </w:t>
+            </w:r>
+            <w:r>
+              <w:rPr>
+                <w:rFonts w:ascii="Calibri" w:hAnsi="Calibri" w:cs="Arial"/>
+                <w:i/>
+                <w:iCs/>
+                <w:color w:val="0070C0"/>
+                <w:sz w:val="18"/>
+                <w:szCs w:val="18"/>
+                <w:lang w:eastAsia="es-CL"/>
+              </w:rPr>
+              <w:t xml:space="preserve">por lo que no solo mis intereses profesionales son en sí los mismos, sino que ahora con mucha más </w:t>
+            </w:r>
+            <w:r>
+              <w:rPr>
+                <w:rFonts w:ascii="Calibri" w:hAnsi="Calibri" w:cs="Arial"/>
+                <w:i/>
+                <w:iCs/>
+                <w:color w:val="0070C0"/>
+                <w:sz w:val="18"/>
+                <w:szCs w:val="18"/>
+                <w:lang w:eastAsia="es-CL"/>
+              </w:rPr>
+              <w:t>razón</w:t>
+            </w:r>
+            <w:r>
+              <w:rPr>
+                <w:rFonts w:ascii="Calibri" w:hAnsi="Calibri" w:cs="Arial"/>
+                <w:i/>
+                <w:iCs/>
+                <w:color w:val="0070C0"/>
+                <w:sz w:val="18"/>
+                <w:szCs w:val="18"/>
+                <w:lang w:eastAsia="es-CL"/>
+              </w:rPr>
+              <w:t>. Me gustaría explorar más el mundo de las bases de datos, creo que a futuro podría estudiar más el tema del tratamiento de datos y particularmente las bases de datos no relacionales.</w:t>
+            </w:r>
+          </w:p>
+          <w:p>
+            <w:pPr>
+              <w:spacing w:after="0" w:line="240" w:lineRule="auto"/>
               <w:jc w:val="both"/>
               <w:rPr>
                 <w:rFonts w:ascii="Calibri" w:hAnsi="Calibri" w:cs="Arial"/>
                 <w:i/>
-                <w:color w:val="0070C0"/>
-                <w:sz w:val="18"/>
-                <w:szCs w:val="20"/>
-                <w:lang w:eastAsia="es-CL"/>
-              </w:rPr>
-            </w:pPr>
-            <w:r>
-              <w:rPr>
-                <w:rFonts w:ascii="Calibri" w:hAnsi="Calibri" w:cs="Arial"/>
-                <w:i/>
-                <w:color w:val="0070C0"/>
-                <w:sz w:val="18"/>
-                <w:szCs w:val="20"/>
-                <w:lang w:eastAsia="es-CL"/>
-              </w:rPr>
-              <w:t>¿Qué intereses profesionales te gustaría explorar o seguir profundizando?</w:t>
-            </w:r>
-          </w:p>
-          <w:p>
-            <w:pPr>
-              <w:pStyle w:val="Prrafodelista"/>
+                <w:iCs/>
+                <w:color w:val="0070C0"/>
+                <w:sz w:val="18"/>
+                <w:szCs w:val="18"/>
+                <w:lang w:eastAsia="es-CL"/>
+              </w:rPr>
+            </w:pPr>
+          </w:p>
+          <w:p>
+            <w:pPr>
+              <w:spacing w:after="0" w:line="240" w:lineRule="auto"/>
               <w:jc w:val="both"/>
               <w:rPr>
                 <w:rFonts w:ascii="Calibri" w:hAnsi="Calibri" w:cs="Arial"/>
-                <w:i/>
-                <w:color w:val="0070C0"/>
-                <w:sz w:val="18"/>
-                <w:szCs w:val="20"/>
-                <w:lang w:eastAsia="es-CL"/>
-              </w:rPr>
-            </w:pPr>
-            <w:r>
-              <w:rPr>
-                <w:rFonts w:ascii="Calibri" w:hAnsi="Calibri" w:cs="Arial"/>
-                <w:i/>
-                <w:color w:val="0070C0"/>
-                <w:sz w:val="18"/>
-                <w:szCs w:val="20"/>
-                <w:lang w:eastAsia="es-CL"/>
-              </w:rPr>
-              <w:t xml:space="preserve">¿Cómo te proyectas laboralmente después de haber terminado tu Proyecto APT? </w:t>
+                <w:b/>
+                <w:bCs/>
+                <w:i/>
+                <w:iCs/>
+                <w:color w:val="0070C0"/>
+                <w:sz w:val="18"/>
+                <w:szCs w:val="18"/>
+                <w:lang w:eastAsia="es-CL"/>
+              </w:rPr>
+            </w:pPr>
+            <w:r>
+              <w:rPr>
+                <w:rFonts w:ascii="Calibri" w:hAnsi="Calibri" w:cs="Arial"/>
+                <w:b/>
+                <w:bCs/>
+                <w:i/>
+                <w:iCs/>
+                <w:color w:val="0070C0"/>
+                <w:sz w:val="18"/>
+                <w:szCs w:val="18"/>
+                <w:lang w:eastAsia="es-CL"/>
+              </w:rPr>
+              <w:t>Valentina Jamett</w:t>
+            </w:r>
+            <w:r>
+              <w:rPr>
+                <w:rFonts w:ascii="Calibri" w:hAnsi="Calibri" w:cs="Arial"/>
+                <w:b/>
+                <w:bCs/>
+                <w:i/>
+                <w:iCs/>
+                <w:color w:val="0070C0"/>
+                <w:sz w:val="18"/>
+                <w:szCs w:val="18"/>
+                <w:lang w:eastAsia="es-CL"/>
+              </w:rPr>
+              <w:t>:</w:t>
+            </w:r>
+          </w:p>
+          <w:p>
+            <w:pPr>
+              <w:spacing w:after="0" w:line="240" w:lineRule="auto"/>
+              <w:jc w:val="both"/>
+              <w:rPr>
+                <w:rFonts w:ascii="Calibri" w:hAnsi="Calibri" w:cs="Arial"/>
+                <w:i/>
+                <w:iCs/>
+                <w:color w:val="0070C0"/>
+                <w:sz w:val="18"/>
+                <w:szCs w:val="18"/>
+                <w:lang w:eastAsia="es-CL"/>
+              </w:rPr>
+            </w:pPr>
+            <w:r>
+              <w:rPr>
+                <w:rFonts w:ascii="Calibri" w:hAnsi="Calibri" w:cs="Arial"/>
+                <w:i/>
+                <w:iCs/>
+                <w:color w:val="0070C0"/>
+                <w:sz w:val="18"/>
+                <w:szCs w:val="18"/>
+                <w:lang w:eastAsia="es-CL"/>
+              </w:rPr>
+              <w:t xml:space="preserve">Nuestro proyecto APT ayudó a profundizar el tema de programación en </w:t>
+            </w:r>
+            <w:proofErr w:type="spellStart"/>
+            <w:r>
+              <w:rPr>
+                <w:rFonts w:ascii="Calibri" w:hAnsi="Calibri" w:cs="Arial"/>
+                <w:i/>
+                <w:iCs/>
+                <w:color w:val="0070C0"/>
+                <w:sz w:val="18"/>
+                <w:szCs w:val="18"/>
+                <w:lang w:eastAsia="es-CL"/>
+              </w:rPr>
+              <w:t>front-end</w:t>
+            </w:r>
+            <w:proofErr w:type="spellEnd"/>
+            <w:r>
+              <w:rPr>
+                <w:rFonts w:ascii="Calibri" w:hAnsi="Calibri" w:cs="Arial"/>
+                <w:i/>
+                <w:iCs/>
+                <w:color w:val="0070C0"/>
+                <w:sz w:val="18"/>
+                <w:szCs w:val="18"/>
+                <w:lang w:eastAsia="es-CL"/>
+              </w:rPr>
+              <w:t>, entre experimentar con el uso de frameworks para diseño y la implementación de funciones nuevas (como barras de carga) permit</w:t>
+            </w:r>
+            <w:r>
+              <w:rPr>
+                <w:rFonts w:ascii="Calibri" w:hAnsi="Calibri" w:cs="Arial"/>
+                <w:i/>
+                <w:iCs/>
+                <w:color w:val="0070C0"/>
+                <w:sz w:val="18"/>
+                <w:szCs w:val="18"/>
+                <w:lang w:eastAsia="es-CL"/>
+              </w:rPr>
+              <w:t>i</w:t>
+            </w:r>
+            <w:r>
+              <w:rPr>
+                <w:rFonts w:ascii="Calibri" w:hAnsi="Calibri" w:cs="Arial"/>
+                <w:i/>
+                <w:iCs/>
+                <w:color w:val="0070C0"/>
+                <w:sz w:val="18"/>
+                <w:szCs w:val="18"/>
+                <w:lang w:eastAsia="es-CL"/>
+              </w:rPr>
+              <w:t>ó abrir la puerta a herramientas y técnicas no vistas anteriormente.</w:t>
+            </w:r>
+            <w:r>
+              <w:rPr>
+                <w:rFonts w:ascii="Calibri" w:hAnsi="Calibri" w:cs="Arial"/>
+                <w:i/>
+                <w:iCs/>
+                <w:color w:val="0070C0"/>
+                <w:sz w:val="18"/>
+                <w:szCs w:val="18"/>
+                <w:lang w:eastAsia="es-CL"/>
+              </w:rPr>
+              <w:t xml:space="preserve"> Respecto a mis proyecciones laborales e</w:t>
+            </w:r>
+            <w:r>
+              <w:rPr>
+                <w:rFonts w:ascii="Calibri" w:hAnsi="Calibri" w:cs="Arial"/>
+                <w:i/>
+                <w:iCs/>
+                <w:color w:val="0070C0"/>
+                <w:sz w:val="18"/>
+                <w:szCs w:val="18"/>
+                <w:lang w:eastAsia="es-CL"/>
+              </w:rPr>
+              <w:t>n lo personal, me gustaría seguir explorando el diseño web, ya que hasta ahora es en lo que me siento más cómoda. Por ahora, me visualizo para trabajar en empresas pequeñas que requieran apoyo en páginas web.</w:t>
+            </w:r>
+          </w:p>
+          <w:p>
+            <w:pPr>
+              <w:jc w:val="both"/>
+              <w:rPr>
+                <w:rFonts w:ascii="Calibri" w:hAnsi="Calibri" w:cs="Arial"/>
+                <w:i/>
+                <w:color w:val="0070C0"/>
+                <w:sz w:val="18"/>
+                <w:szCs w:val="20"/>
+                <w:lang w:eastAsia="es-CL"/>
+              </w:rPr>
+            </w:pPr>
+            <w:r>
+              <w:rPr>
+                <w:rFonts w:ascii="Calibri" w:hAnsi="Calibri" w:cs="Arial"/>
+                <w:i/>
+                <w:color w:val="0070C0"/>
+                <w:sz w:val="18"/>
+                <w:szCs w:val="20"/>
+                <w:lang w:eastAsia="es-CL"/>
+              </w:rPr>
+              <w:t xml:space="preserve"> </w:t>
             </w:r>
           </w:p>
         </w:tc>

</xml_diff>